<commit_message>
W1 report: record MVTec data access blocker (license facts, options, schedule impact); note GitHub push resolved
</commit_message>
<xml_diff>
--- a/week1/W1_WEEKLY_REPORT.docx
+++ b/week1/W1_WEEKLY_REPORT.docx
@@ -1817,6 +1817,84 @@
     </w:p>
     <w:p>
       <w:pPr>
+        <w:pStyle w:val="ListBullet"/>
+        <w:spacing w:after="40" w:line="283" w:lineRule="auto"/>
+      </w:pPr>
+      <w:r>
+        <w:rPr>
+          <w:rFonts w:ascii="Segoe UI" w:hAnsi="Segoe UI" w:eastAsia="宋体"/>
+          <w:b/>
+          <w:i w:val="0"/>
+          <w:sz w:val="20"/>
+        </w:rPr>
+        <w:t>代码推送</w:t>
+      </w:r>
+      <w:r>
+        <w:rPr>
+          <w:rFonts w:ascii="Segoe UI" w:hAnsi="Segoe UI" w:eastAsia="宋体"/>
+          <w:b w:val="0"/>
+          <w:i w:val="0"/>
+          <w:sz w:val="20"/>
+        </w:rPr>
+        <w:t>：</w:t>
+      </w:r>
+      <w:r>
+        <w:rPr>
+          <w:rFonts w:ascii="Consolas" w:hAnsi="Consolas" w:eastAsia="Consolas"/>
+          <w:b w:val="0"/>
+          <w:color w:val="B03030"/>
+          <w:sz w:val="19"/>
+        </w:rPr>
+        <w:t>git@github.com:CAPOOCATXP/research01.git</w:t>
+      </w:r>
+      <w:r>
+        <w:rPr>
+          <w:rFonts w:ascii="Segoe UI" w:hAnsi="Segoe UI" w:eastAsia="宋体"/>
+          <w:b w:val="0"/>
+          <w:i w:val="0"/>
+          <w:sz w:val="20"/>
+        </w:rPr>
+        <w:t xml:space="preserve">（branch </w:t>
+      </w:r>
+      <w:r>
+        <w:rPr>
+          <w:rFonts w:ascii="Consolas" w:hAnsi="Consolas" w:eastAsia="Consolas"/>
+          <w:b w:val="0"/>
+          <w:color w:val="B03030"/>
+          <w:sz w:val="19"/>
+        </w:rPr>
+        <w:t>main</w:t>
+      </w:r>
+      <w:r>
+        <w:rPr>
+          <w:rFonts w:ascii="Segoe UI" w:hAnsi="Segoe UI" w:eastAsia="宋体"/>
+          <w:b w:val="0"/>
+          <w:i w:val="0"/>
+          <w:sz w:val="20"/>
+        </w:rPr>
+        <w:t xml:space="preserve">，首次推送成功；SSH 专用密钥 </w:t>
+      </w:r>
+      <w:r>
+        <w:rPr>
+          <w:rFonts w:ascii="Consolas" w:hAnsi="Consolas" w:eastAsia="Consolas"/>
+          <w:b w:val="0"/>
+          <w:color w:val="B03030"/>
+          <w:sz w:val="19"/>
+        </w:rPr>
+        <w:t>~/.ssh/id_ed25519_github</w:t>
+      </w:r>
+      <w:r>
+        <w:rPr>
+          <w:rFonts w:ascii="Segoe UI" w:hAnsi="Segoe UI" w:eastAsia="宋体"/>
+          <w:b w:val="0"/>
+          <w:i w:val="0"/>
+          <w:sz w:val="20"/>
+        </w:rPr>
+        <w:t>）</w:t>
+      </w:r>
+    </w:p>
+    <w:p>
+      <w:pPr>
         <w:spacing w:before="240" w:after="100" w:line="264" w:lineRule="auto"/>
       </w:pPr>
       <w:r>
@@ -1850,7 +1928,7 @@
           <w:i w:val="0"/>
           <w:sz w:val="20"/>
         </w:rPr>
-        <w:t>数据未获批</w:t>
+        <w:t>数据获取受阻（本周最主要问题）</w:t>
       </w:r>
       <w:r>
         <w:rPr>
@@ -1877,7 +1955,190 @@
           <w:i w:val="0"/>
           <w:sz w:val="20"/>
         </w:rPr>
-        <w:t>。需要：确认能否以学校/导师名义登记。</w:t>
+        <w:t>。需要：请导师以学校邮箱登记，或明确授权使用某个具体镜像。</w:t>
+      </w:r>
+    </w:p>
+    <w:p>
+      <w:pPr>
+        <w:spacing w:before="0" w:after="80" w:line="264" w:lineRule="auto"/>
+      </w:pPr>
+      <w:r>
+        <w:rPr>
+          <w:rFonts w:ascii="Segoe UI" w:hAnsi="Segoe UI" w:eastAsia="宋体"/>
+          <w:b/>
+          <w:i w:val="0"/>
+          <w:sz w:val="20"/>
+        </w:rPr>
+        <w:t>已核实的事实</w:t>
+      </w:r>
+      <w:r>
+        <w:rPr>
+          <w:rFonts w:ascii="Segoe UI" w:hAnsi="Segoe UI" w:eastAsia="宋体"/>
+          <w:b w:val="0"/>
+          <w:i w:val="0"/>
+          <w:sz w:val="20"/>
+        </w:rPr>
+        <w:t xml:space="preserve">：MVTec AD 官方页面写明数据以 </w:t>
+      </w:r>
+      <w:r>
+        <w:rPr>
+          <w:rFonts w:ascii="Segoe UI" w:hAnsi="Segoe UI" w:eastAsia="宋体"/>
+          <w:b/>
+          <w:i w:val="0"/>
+          <w:sz w:val="20"/>
+        </w:rPr>
+        <w:t>CC BY-NC-SA 4.0</w:t>
+      </w:r>
+      <w:r>
+        <w:rPr>
+          <w:rFonts w:ascii="Segoe UI" w:hAnsi="Segoe UI" w:eastAsia="宋体"/>
+          <w:b w:val="0"/>
+          <w:i w:val="0"/>
+          <w:sz w:val="20"/>
+        </w:rPr>
+        <w:t xml:space="preserve"> 发布——该许可</w:t>
+      </w:r>
+      <w:r>
+        <w:rPr>
+          <w:rFonts w:ascii="Segoe UI" w:hAnsi="Segoe UI" w:eastAsia="宋体"/>
+          <w:b/>
+          <w:i w:val="0"/>
+          <w:sz w:val="20"/>
+        </w:rPr>
+        <w:t>允许再分发</w:t>
+      </w:r>
+    </w:p>
+    <w:p>
+      <w:pPr>
+        <w:spacing w:before="0" w:after="80" w:line="264" w:lineRule="auto"/>
+      </w:pPr>
+      <w:r>
+        <w:rPr>
+          <w:rFonts w:ascii="Segoe UI" w:hAnsi="Segoe UI" w:eastAsia="宋体"/>
+          <w:b w:val="0"/>
+          <w:i w:val="0"/>
+          <w:sz w:val="20"/>
+        </w:rPr>
+        <w:t>（署名 + 非商用 + 相同方式共享），因此第三方镜像在法律上可用；但问题在于 ① 偏离导师指定的"官方来源"，</w:t>
+      </w:r>
+    </w:p>
+    <w:p>
+      <w:pPr>
+        <w:spacing w:before="0" w:after="80" w:line="264" w:lineRule="auto"/>
+      </w:pPr>
+      <w:r>
+        <w:rPr>
+          <w:rFonts w:ascii="Segoe UI" w:hAnsi="Segoe UI" w:eastAsia="宋体"/>
+          <w:b w:val="0"/>
+          <w:i w:val="0"/>
+          <w:sz w:val="20"/>
+        </w:rPr>
+        <w:t>② 镜像可能被裁剪，导致 bottle/tile/screw 的样本数与划分</w:t>
+      </w:r>
+      <w:r>
+        <w:rPr>
+          <w:rFonts w:ascii="Segoe UI" w:hAnsi="Segoe UI" w:eastAsia="宋体"/>
+          <w:b/>
+          <w:i w:val="0"/>
+          <w:sz w:val="20"/>
+        </w:rPr>
+        <w:t>与文献不可比</w:t>
+      </w:r>
+      <w:r>
+        <w:rPr>
+          <w:rFonts w:ascii="Segoe UI" w:hAnsi="Segoe UI" w:eastAsia="宋体"/>
+          <w:b w:val="0"/>
+          <w:i w:val="0"/>
+          <w:sz w:val="20"/>
+        </w:rPr>
+        <w:t>，"≥2 个百分点"的判据随之失效。</w:t>
+      </w:r>
+    </w:p>
+    <w:p>
+      <w:pPr>
+        <w:spacing w:before="0" w:after="80" w:line="264" w:lineRule="auto"/>
+      </w:pPr>
+      <w:r>
+        <w:rPr>
+          <w:rFonts w:ascii="Segoe UI" w:hAnsi="Segoe UI" w:eastAsia="宋体"/>
+          <w:b/>
+          <w:i w:val="0"/>
+          <w:sz w:val="20"/>
+        </w:rPr>
+        <w:t>本周决定：暂不采用镜像</w:t>
+      </w:r>
+      <w:r>
+        <w:rPr>
+          <w:rFonts w:ascii="Segoe UI" w:hAnsi="Segoe UI" w:eastAsia="宋体"/>
+          <w:b w:val="0"/>
+          <w:i w:val="0"/>
+          <w:sz w:val="20"/>
+        </w:rPr>
+        <w:t>（用户 2026-10-10 明确"暂时不做"）。</w:t>
+      </w:r>
+    </w:p>
+    <w:p>
+      <w:pPr>
+        <w:spacing w:before="0" w:after="80" w:line="264" w:lineRule="auto"/>
+      </w:pPr>
+      <w:r>
+        <w:rPr>
+          <w:rFonts w:ascii="Segoe UI" w:hAnsi="Segoe UI" w:eastAsia="宋体"/>
+          <w:b/>
+          <w:i w:val="0"/>
+          <w:sz w:val="20"/>
+        </w:rPr>
+        <w:t>排期影响</w:t>
+      </w:r>
+      <w:r>
+        <w:rPr>
+          <w:rFonts w:ascii="Segoe UI" w:hAnsi="Segoe UI" w:eastAsia="宋体"/>
+          <w:b w:val="0"/>
+          <w:i w:val="0"/>
+          <w:sz w:val="20"/>
+        </w:rPr>
+        <w:t>：Phase 2 的复现、按划分列图像与标签、PatchCore 最小示例、AnomalyDINO 冒烟</w:t>
+      </w:r>
+      <w:r>
+        <w:rPr>
+          <w:rFonts w:ascii="Segoe UI" w:hAnsi="Segoe UI" w:eastAsia="宋体"/>
+          <w:b/>
+          <w:i w:val="0"/>
+          <w:sz w:val="20"/>
+        </w:rPr>
+        <w:t>全部顺延</w:t>
+      </w:r>
+      <w:r>
+        <w:rPr>
+          <w:rFonts w:ascii="Segoe UI" w:hAnsi="Segoe UI" w:eastAsia="宋体"/>
+          <w:b w:val="0"/>
+          <w:i w:val="0"/>
+          <w:sz w:val="20"/>
+        </w:rPr>
+        <w:t>；</w:t>
+      </w:r>
+    </w:p>
+    <w:p>
+      <w:pPr>
+        <w:spacing w:before="0" w:after="80" w:line="264" w:lineRule="auto"/>
+      </w:pPr>
+      <w:r>
+        <w:rPr>
+          <w:rFonts w:ascii="Segoe UI" w:hAnsi="Segoe UI" w:eastAsia="宋体"/>
+          <w:b/>
+          <w:i w:val="0"/>
+          <w:sz w:val="20"/>
+        </w:rPr>
+        <w:t>MVTec AD 2 带私有测试服务器、不存在可用镜像，必须走官方渠道</w:t>
+      </w:r>
+      <w:r>
+        <w:rPr>
+          <w:rFonts w:ascii="Segoe UI" w:hAnsi="Segoe UI" w:eastAsia="宋体"/>
+          <w:b w:val="0"/>
+          <w:i w:val="0"/>
+          <w:sz w:val="20"/>
+        </w:rPr>
+        <w:t>。关键路径目前就卡在这一步。</w:t>
       </w:r>
     </w:p>
     <w:p>
@@ -1943,7 +2204,25 @@
           <w:i w:val="0"/>
           <w:sz w:val="20"/>
         </w:rPr>
-        <w:t xml:space="preserve">3. </w:t>
+        <w:t>3. ~~</w:t>
+      </w:r>
+      <w:r>
+        <w:rPr>
+          <w:rFonts w:ascii="Consolas" w:hAnsi="Consolas" w:eastAsia="Consolas"/>
+          <w:b w:val="0"/>
+          <w:color w:val="B03030"/>
+          <w:sz w:val="19"/>
+        </w:rPr>
+        <w:t>gh</w:t>
+      </w:r>
+      <w:r>
+        <w:rPr>
+          <w:rFonts w:ascii="Segoe UI" w:hAnsi="Segoe UI" w:eastAsia="宋体"/>
+          <w:b w:val="0"/>
+          <w:i w:val="0"/>
+          <w:sz w:val="20"/>
+        </w:rPr>
+        <w:t xml:space="preserve"> CLI 未安装~~ </w:t>
       </w:r>
       <w:r>
         <w:rPr>
@@ -1952,7 +2231,7 @@
           <w:i w:val="0"/>
           <w:sz w:val="20"/>
         </w:rPr>
-        <w:t>`gh` CLI 未安装</w:t>
+        <w:t>已解决</w:t>
       </w:r>
       <w:r>
         <w:rPr>
@@ -1961,7 +2240,79 @@
           <w:i w:val="0"/>
           <w:sz w:val="20"/>
         </w:rPr>
-        <w:t>，我无法建仓/推送（你说已接入 GitHub CAPOOCATXP）。需要：是否安装 gh，或给我远程仓库地址。</w:t>
+        <w:t xml:space="preserve">：改用 SSH 专用密钥 </w:t>
+      </w:r>
+      <w:r>
+        <w:rPr>
+          <w:rFonts w:ascii="Consolas" w:hAnsi="Consolas" w:eastAsia="Consolas"/>
+          <w:b w:val="0"/>
+          <w:color w:val="B03030"/>
+          <w:sz w:val="19"/>
+        </w:rPr>
+        <w:t>~/.ssh/id_ed25519_github</w:t>
+      </w:r>
+      <w:r>
+        <w:rPr>
+          <w:rFonts w:ascii="Segoe UI" w:hAnsi="Segoe UI" w:eastAsia="宋体"/>
+          <w:b w:val="0"/>
+          <w:i w:val="0"/>
+          <w:sz w:val="20"/>
+        </w:rPr>
+        <w:t xml:space="preserve"> 直接推送，</w:t>
+      </w:r>
+      <w:r>
+        <w:rPr>
+          <w:rFonts w:ascii="Consolas" w:hAnsi="Consolas" w:eastAsia="Consolas"/>
+          <w:b w:val="0"/>
+          <w:color w:val="B03030"/>
+          <w:sz w:val="19"/>
+        </w:rPr>
+        <w:t>main</w:t>
+      </w:r>
+      <w:r>
+        <w:rPr>
+          <w:rFonts w:ascii="Segoe UI" w:hAnsi="Segoe UI" w:eastAsia="宋体"/>
+          <w:b w:val="0"/>
+          <w:i w:val="0"/>
+          <w:sz w:val="20"/>
+        </w:rPr>
+        <w:t xml:space="preserve"> 分支已上传到 </w:t>
+      </w:r>
+      <w:r>
+        <w:rPr>
+          <w:rFonts w:ascii="Consolas" w:hAnsi="Consolas" w:eastAsia="Consolas"/>
+          <w:b w:val="0"/>
+          <w:color w:val="B03030"/>
+          <w:sz w:val="19"/>
+        </w:rPr>
+        <w:t>github.com/CAPOOCATXP/research01</w:t>
+      </w:r>
+      <w:r>
+        <w:rPr>
+          <w:rFonts w:ascii="Segoe UI" w:hAnsi="Segoe UI" w:eastAsia="宋体"/>
+          <w:b w:val="0"/>
+          <w:i w:val="0"/>
+          <w:sz w:val="20"/>
+        </w:rPr>
+        <w:t>。</w:t>
+      </w:r>
+      <w:r>
+        <w:rPr>
+          <w:rFonts w:ascii="Consolas" w:hAnsi="Consolas" w:eastAsia="Consolas"/>
+          <w:b w:val="0"/>
+          <w:color w:val="B03030"/>
+          <w:sz w:val="19"/>
+        </w:rPr>
+        <w:t>gh</w:t>
+      </w:r>
+      <w:r>
+        <w:rPr>
+          <w:rFonts w:ascii="Segoe UI" w:hAnsi="Segoe UI" w:eastAsia="宋体"/>
+          <w:b w:val="0"/>
+          <w:i w:val="0"/>
+          <w:sz w:val="20"/>
+        </w:rPr>
+        <w:t xml:space="preserve"> 仍然缺失，但本阶段不需要它。</w:t>
       </w:r>
     </w:p>
     <w:p>

</xml_diff>

<commit_message>
W1 report: fix strikethrough markup not supported by the md->docx converter
</commit_message>
<xml_diff>
--- a/week1/W1_WEEKLY_REPORT.docx
+++ b/week1/W1_WEEKLY_REPORT.docx
@@ -2204,25 +2204,7 @@
           <w:i w:val="0"/>
           <w:sz w:val="20"/>
         </w:rPr>
-        <w:t>3. ~~</w:t>
-      </w:r>
-      <w:r>
-        <w:rPr>
-          <w:rFonts w:ascii="Consolas" w:hAnsi="Consolas" w:eastAsia="Consolas"/>
-          <w:b w:val="0"/>
-          <w:color w:val="B03030"/>
-          <w:sz w:val="19"/>
-        </w:rPr>
-        <w:t>gh</w:t>
-      </w:r>
-      <w:r>
-        <w:rPr>
-          <w:rFonts w:ascii="Segoe UI" w:hAnsi="Segoe UI" w:eastAsia="宋体"/>
-          <w:b w:val="0"/>
-          <w:i w:val="0"/>
-          <w:sz w:val="20"/>
-        </w:rPr>
-        <w:t xml:space="preserve"> CLI 未安装~~ </w:t>
+        <w:t xml:space="preserve">3. </w:t>
       </w:r>
       <w:r>
         <w:rPr>
@@ -2231,7 +2213,7 @@
           <w:i w:val="0"/>
           <w:sz w:val="20"/>
         </w:rPr>
-        <w:t>已解决</w:t>
+        <w:t>gh CLI 未安装 → 已解决</w:t>
       </w:r>
       <w:r>
         <w:rPr>

</xml_diff>

<commit_message>
fix distance-check chunk budget (bs=256 needed 14.6GiB and was not reproducible); correct the retracted numbers in the docs; add unified runner scripts/run.py
</commit_message>
<xml_diff>
--- a/week1/W1_WEEKLY_REPORT.docx
+++ b/week1/W1_WEEKLY_REPORT.docx
@@ -2545,6 +2545,79 @@
     </w:p>
     <w:p>
       <w:pPr>
+        <w:spacing w:before="0" w:after="80" w:line="264" w:lineRule="auto"/>
+      </w:pPr>
+      <w:r>
+        <w:rPr>
+          <w:rFonts w:ascii="Segoe UI" w:hAnsi="Segoe UI" w:eastAsia="宋体"/>
+          <w:b/>
+          <w:i w:val="0"/>
+          <w:sz w:val="20"/>
+        </w:rPr>
+        <w:t>并且块大小必须按内存预算反推</w:t>
+      </w:r>
+      <w:r>
+        <w:rPr>
+          <w:rFonts w:ascii="Segoe UI" w:hAnsi="Segoe UI" w:eastAsia="宋体"/>
+          <w:b w:val="0"/>
+          <w:i w:val="0"/>
+          <w:sz w:val="20"/>
+        </w:rPr>
+        <w:t>：我曾写死 bs=256（单块中间张量 14.6 GiB），第一次靠内存空闲"跑通"、</w:t>
+      </w:r>
+    </w:p>
+    <w:p>
+      <w:pPr>
+        <w:spacing w:before="0" w:after="80" w:line="264" w:lineRule="auto"/>
+      </w:pPr>
+      <w:r>
+        <w:rPr>
+          <w:rFonts w:ascii="Segoe UI" w:hAnsi="Segoe UI" w:eastAsia="宋体"/>
+          <w:b w:val="0"/>
+          <w:i w:val="0"/>
+          <w:sz w:val="20"/>
+        </w:rPr>
+        <w:t xml:space="preserve">第二次同一条命令直接 </w:t>
+      </w:r>
+      <w:r>
+        <w:rPr>
+          <w:rFonts w:ascii="Consolas" w:hAnsi="Consolas" w:eastAsia="Consolas"/>
+          <w:b w:val="0"/>
+          <w:color w:val="B03030"/>
+          <w:sz w:val="19"/>
+        </w:rPr>
+        <w:t>ArrayMemoryError</w:t>
+      </w:r>
+      <w:r>
+        <w:rPr>
+          <w:rFonts w:ascii="Segoe UI" w:hAnsi="Segoe UI" w:eastAsia="宋体"/>
+          <w:b w:val="0"/>
+          <w:i w:val="0"/>
+          <w:sz w:val="20"/>
+        </w:rPr>
+        <w:t xml:space="preserve"> —— </w:t>
+      </w:r>
+      <w:r>
+        <w:rPr>
+          <w:rFonts w:ascii="Segoe UI" w:hAnsi="Segoe UI" w:eastAsia="宋体"/>
+          <w:b/>
+          <w:i w:val="0"/>
+          <w:sz w:val="20"/>
+        </w:rPr>
+        <w:t>一次跑通不等于可复现</w:t>
+      </w:r>
+      <w:r>
+        <w:rPr>
+          <w:rFonts w:ascii="Segoe UI" w:hAnsi="Segoe UI" w:eastAsia="宋体"/>
+          <w:b w:val="0"/>
+          <w:i w:val="0"/>
+          <w:sz w:val="20"/>
+        </w:rPr>
+        <w:t>，该结论已作废，改为按 2 GiB 预算自动定块。</w:t>
+      </w:r>
+    </w:p>
+    <w:p>
+      <w:pPr>
         <w:spacing w:before="240" w:after="100" w:line="264" w:lineRule="auto"/>
       </w:pPr>
       <w:r>

</xml_diff>